<commit_message>
Se agregó la actividad 8.3 realizada
</commit_message>
<xml_diff>
--- a/Entregas/Ejercicios_Actividad_3/Entrega 3.docx
+++ b/Entregas/Ejercicios_Actividad_3/Entrega 3.docx
@@ -332,26 +332,61 @@
         <w:rPr>
           <w:b/>
           <w:bCs/>
-        </w:rPr>
-      </w:pPr>
-      <w:r>
-        <w:rPr>
-          <w:b/>
-          <w:bCs/>
+          <w:noProof/>
+          <w:sz w:val="40"/>
+          <w:szCs w:val="40"/>
+        </w:rPr>
+      </w:pPr>
+      <w:r>
+        <w:rPr>
+          <w:b/>
+          <w:bCs/>
+          <w:sz w:val="40"/>
+          <w:szCs w:val="40"/>
         </w:rPr>
         <w:t>Ejercicio #1</w:t>
       </w:r>
-    </w:p>
-    <w:p>
-      <w:r>
-        <w:rPr>
+      <w:r>
+        <w:rPr>
+          <w:b/>
+          <w:bCs/>
+          <w:sz w:val="40"/>
+          <w:szCs w:val="40"/>
+        </w:rPr>
+        <w:t xml:space="preserve"> - </w:t>
+      </w:r>
+      <w:r>
+        <w:rPr>
+          <w:b/>
+          <w:bCs/>
           <w:noProof/>
+          <w:sz w:val="40"/>
+          <w:szCs w:val="40"/>
+        </w:rPr>
+        <w:t>Ejercicio 8.2</w:t>
+      </w:r>
+    </w:p>
+    <w:p>
+      <w:pPr>
+        <w:rPr>
+          <w:b/>
+          <w:bCs/>
+          <w:sz w:val="40"/>
+          <w:szCs w:val="40"/>
+        </w:rPr>
+      </w:pPr>
+      <w:r>
+        <w:rPr>
+          <w:b/>
+          <w:bCs/>
+          <w:sz w:val="40"/>
+          <w:szCs w:val="40"/>
         </w:rPr>
         <w:drawing>
-          <wp:inline distT="0" distB="0" distL="0" distR="0" wp14:anchorId="3EB76879" wp14:editId="5622CE79">
-            <wp:extent cx="5107556" cy="944880"/>
-            <wp:effectExtent l="0" t="0" r="0" b="7620"/>
-            <wp:docPr id="642808195" name="Imagen 1"/>
+          <wp:inline distT="0" distB="0" distL="0" distR="0" wp14:anchorId="11BCD9BF" wp14:editId="343FF789">
+            <wp:extent cx="5433060" cy="2152598"/>
+            <wp:effectExtent l="0" t="0" r="0" b="635"/>
+            <wp:docPr id="1441504522" name="Imagen 1"/>
             <wp:cNvGraphicFramePr>
               <a:graphicFrameLocks xmlns:a="http://schemas.openxmlformats.org/drawingml/2006/main" noChangeAspect="1"/>
             </wp:cNvGraphicFramePr>
@@ -359,7 +394,7 @@
               <a:graphicData uri="http://schemas.openxmlformats.org/drawingml/2006/picture">
                 <pic:pic xmlns:pic="http://schemas.openxmlformats.org/drawingml/2006/picture">
                   <pic:nvPicPr>
-                    <pic:cNvPr id="642808195" name=""/>
+                    <pic:cNvPr id="1441504522" name=""/>
                     <pic:cNvPicPr/>
                   </pic:nvPicPr>
                   <pic:blipFill>
@@ -371,7 +406,7 @@
                   <pic:spPr>
                     <a:xfrm>
                       <a:off x="0" y="0"/>
-                      <a:ext cx="5165595" cy="955617"/>
+                      <a:ext cx="5443936" cy="2156907"/>
                     </a:xfrm>
                     <a:prstGeom prst="rect">
                       <a:avLst/>
@@ -385,15 +420,26 @@
       </w:r>
     </w:p>
     <w:p>
-      <w:r>
-        <w:rPr>
-          <w:noProof/>
+      <w:pPr>
+        <w:rPr>
+          <w:b/>
+          <w:bCs/>
+          <w:sz w:val="40"/>
+          <w:szCs w:val="40"/>
+        </w:rPr>
+      </w:pPr>
+      <w:r>
+        <w:rPr>
+          <w:b/>
+          <w:bCs/>
+          <w:sz w:val="40"/>
+          <w:szCs w:val="40"/>
         </w:rPr>
         <w:drawing>
-          <wp:inline distT="0" distB="0" distL="0" distR="0" wp14:anchorId="0F87C040" wp14:editId="4BDD70FA">
-            <wp:extent cx="5509260" cy="5882031"/>
-            <wp:effectExtent l="0" t="0" r="0" b="4445"/>
-            <wp:docPr id="210136503" name="Imagen 1" descr="Texto&#10;&#10;El contenido generado por IA puede ser incorrecto."/>
+          <wp:inline distT="0" distB="0" distL="0" distR="0" wp14:anchorId="2BBFACDA" wp14:editId="11CB0267">
+            <wp:extent cx="6858000" cy="4824095"/>
+            <wp:effectExtent l="0" t="0" r="0" b="0"/>
+            <wp:docPr id="427012837" name="Imagen 1"/>
             <wp:cNvGraphicFramePr>
               <a:graphicFrameLocks xmlns:a="http://schemas.openxmlformats.org/drawingml/2006/main" noChangeAspect="1"/>
             </wp:cNvGraphicFramePr>
@@ -401,7 +447,7 @@
               <a:graphicData uri="http://schemas.openxmlformats.org/drawingml/2006/picture">
                 <pic:pic xmlns:pic="http://schemas.openxmlformats.org/drawingml/2006/picture">
                   <pic:nvPicPr>
-                    <pic:cNvPr id="210136503" name="Imagen 1" descr="Texto&#10;&#10;El contenido generado por IA puede ser incorrecto."/>
+                    <pic:cNvPr id="427012837" name=""/>
                     <pic:cNvPicPr/>
                   </pic:nvPicPr>
                   <pic:blipFill>
@@ -413,7 +459,7 @@
                   <pic:spPr>
                     <a:xfrm>
                       <a:off x="0" y="0"/>
-                      <a:ext cx="5521681" cy="5895292"/>
+                      <a:ext cx="6858000" cy="4824095"/>
                     </a:xfrm>
                     <a:prstGeom prst="rect">
                       <a:avLst/>
@@ -427,57 +473,27 @@
       </w:r>
     </w:p>
     <w:p>
-      <w:r>
-        <w:t>Repositorio GitHub:</w:t>
-      </w:r>
-    </w:p>
-    <w:p>
-      <w:hyperlink r:id="rId7" w:history="1">
-        <w:r>
-          <w:rPr>
-            <w:rStyle w:val="Hipervnculo"/>
-          </w:rPr>
-          <w:t>https://github.com/DiegoPortoR/Programacion-Orientada-a-Objetos/blob/main/Entraga%201/Actividad1.py</w:t>
-        </w:r>
-      </w:hyperlink>
-    </w:p>
-    <w:p/>
-    <w:p/>
-    <w:p/>
-    <w:p/>
-    <w:p>
-      <w:pPr>
-        <w:rPr>
-          <w:b/>
-          <w:bCs/>
-        </w:rPr>
-      </w:pPr>
-      <w:r>
-        <w:rPr>
-          <w:b/>
-          <w:bCs/>
-        </w:rPr>
-        <w:t>Ejercicio #2</w:t>
-      </w:r>
-    </w:p>
-    <w:p>
-      <w:pPr>
-        <w:rPr>
-          <w:b/>
-          <w:bCs/>
-        </w:rPr>
-      </w:pPr>
-      <w:r>
-        <w:rPr>
-          <w:b/>
-          <w:bCs/>
-          <w:noProof/>
-        </w:rPr>
+      <w:pPr>
+        <w:rPr>
+          <w:b/>
+          <w:bCs/>
+          <w:sz w:val="40"/>
+          <w:szCs w:val="40"/>
+        </w:rPr>
+      </w:pPr>
+      <w:r>
+        <w:rPr>
+          <w:b/>
+          <w:bCs/>
+          <w:sz w:val="40"/>
+          <w:szCs w:val="40"/>
+        </w:rPr>
+        <w:lastRenderedPageBreak/>
         <w:drawing>
-          <wp:inline distT="0" distB="0" distL="0" distR="0" wp14:anchorId="5F5F06CD" wp14:editId="65C49EAD">
-            <wp:extent cx="4210156" cy="1897380"/>
-            <wp:effectExtent l="0" t="0" r="0" b="7620"/>
-            <wp:docPr id="1633231383" name="Imagen 1" descr="Interfaz de usuario gráfica, Texto, Aplicación, Correo electrónico&#10;&#10;El contenido generado por IA puede ser incorrecto."/>
+          <wp:inline distT="0" distB="0" distL="0" distR="0" wp14:anchorId="66980ADE" wp14:editId="79D80127">
+            <wp:extent cx="6431280" cy="1980001"/>
+            <wp:effectExtent l="0" t="0" r="7620" b="1270"/>
+            <wp:docPr id="550792649" name="Imagen 1"/>
             <wp:cNvGraphicFramePr>
               <a:graphicFrameLocks xmlns:a="http://schemas.openxmlformats.org/drawingml/2006/main" noChangeAspect="1"/>
             </wp:cNvGraphicFramePr>
@@ -485,7 +501,60 @@
               <a:graphicData uri="http://schemas.openxmlformats.org/drawingml/2006/picture">
                 <pic:pic xmlns:pic="http://schemas.openxmlformats.org/drawingml/2006/picture">
                   <pic:nvPicPr>
-                    <pic:cNvPr id="1633231383" name="Imagen 1" descr="Interfaz de usuario gráfica, Texto, Aplicación, Correo electrónico&#10;&#10;El contenido generado por IA puede ser incorrecto."/>
+                    <pic:cNvPr id="550792649" name=""/>
+                    <pic:cNvPicPr/>
+                  </pic:nvPicPr>
+                  <pic:blipFill>
+                    <a:blip r:embed="rId7"/>
+                    <a:stretch>
+                      <a:fillRect/>
+                    </a:stretch>
+                  </pic:blipFill>
+                  <pic:spPr>
+                    <a:xfrm>
+                      <a:off x="0" y="0"/>
+                      <a:ext cx="6446178" cy="1984588"/>
+                    </a:xfrm>
+                    <a:prstGeom prst="rect">
+                      <a:avLst/>
+                    </a:prstGeom>
+                  </pic:spPr>
+                </pic:pic>
+              </a:graphicData>
+            </a:graphic>
+          </wp:inline>
+        </w:drawing>
+      </w:r>
+    </w:p>
+    <w:p>
+      <w:pPr>
+        <w:rPr>
+          <w:b/>
+          <w:bCs/>
+          <w:sz w:val="40"/>
+          <w:szCs w:val="40"/>
+        </w:rPr>
+      </w:pPr>
+      <w:r>
+        <w:rPr>
+          <w:b/>
+          <w:bCs/>
+          <w:sz w:val="40"/>
+          <w:szCs w:val="40"/>
+        </w:rPr>
+        <w:drawing>
+          <wp:inline distT="0" distB="0" distL="0" distR="0" wp14:anchorId="5CECB186" wp14:editId="6D4055D1">
+            <wp:extent cx="6430711" cy="3813175"/>
+            <wp:effectExtent l="0" t="0" r="8255" b="0"/>
+            <wp:docPr id="1684252064" name="Imagen 1"/>
+            <wp:cNvGraphicFramePr>
+              <a:graphicFrameLocks xmlns:a="http://schemas.openxmlformats.org/drawingml/2006/main" noChangeAspect="1"/>
+            </wp:cNvGraphicFramePr>
+            <a:graphic xmlns:a="http://schemas.openxmlformats.org/drawingml/2006/main">
+              <a:graphicData uri="http://schemas.openxmlformats.org/drawingml/2006/picture">
+                <pic:pic xmlns:pic="http://schemas.openxmlformats.org/drawingml/2006/picture">
+                  <pic:nvPicPr>
+                    <pic:cNvPr id="1684252064" name=""/>
                     <pic:cNvPicPr/>
                   </pic:nvPicPr>
                   <pic:blipFill>
@@ -497,7 +566,7 @@
                   <pic:spPr>
                     <a:xfrm>
                       <a:off x="0" y="0"/>
-                      <a:ext cx="4266859" cy="1922934"/>
+                      <a:ext cx="6442885" cy="3820394"/>
                     </a:xfrm>
                     <a:prstGeom prst="rect">
                       <a:avLst/>
@@ -515,19 +584,22 @@
         <w:rPr>
           <w:b/>
           <w:bCs/>
-        </w:rPr>
-      </w:pPr>
-      <w:r>
-        <w:rPr>
-          <w:b/>
-          <w:bCs/>
-          <w:noProof/>
+          <w:sz w:val="40"/>
+          <w:szCs w:val="40"/>
+        </w:rPr>
+      </w:pPr>
+      <w:r>
+        <w:rPr>
+          <w:b/>
+          <w:bCs/>
+          <w:sz w:val="40"/>
+          <w:szCs w:val="40"/>
         </w:rPr>
         <w:drawing>
-          <wp:inline distT="0" distB="0" distL="0" distR="0" wp14:anchorId="35295B03" wp14:editId="1D3CEC0D">
-            <wp:extent cx="6066044" cy="5074920"/>
-            <wp:effectExtent l="0" t="0" r="0" b="0"/>
-            <wp:docPr id="1164869236" name="Imagen 1" descr="Texto&#10;&#10;El contenido generado por IA puede ser incorrecto."/>
+          <wp:inline distT="0" distB="0" distL="0" distR="0" wp14:anchorId="3A45E778" wp14:editId="5E233061">
+            <wp:extent cx="6470604" cy="3033395"/>
+            <wp:effectExtent l="0" t="0" r="6985" b="0"/>
+            <wp:docPr id="561142898" name="Imagen 1"/>
             <wp:cNvGraphicFramePr>
               <a:graphicFrameLocks xmlns:a="http://schemas.openxmlformats.org/drawingml/2006/main" noChangeAspect="1"/>
             </wp:cNvGraphicFramePr>
@@ -535,7 +607,7 @@
               <a:graphicData uri="http://schemas.openxmlformats.org/drawingml/2006/picture">
                 <pic:pic xmlns:pic="http://schemas.openxmlformats.org/drawingml/2006/picture">
                   <pic:nvPicPr>
-                    <pic:cNvPr id="1164869236" name="Imagen 1" descr="Texto&#10;&#10;El contenido generado por IA puede ser incorrecto."/>
+                    <pic:cNvPr id="561142898" name=""/>
                     <pic:cNvPicPr/>
                   </pic:nvPicPr>
                   <pic:blipFill>
@@ -547,7 +619,7 @@
                   <pic:spPr>
                     <a:xfrm>
                       <a:off x="0" y="0"/>
-                      <a:ext cx="6099855" cy="5103207"/>
+                      <a:ext cx="6474451" cy="3035198"/>
                     </a:xfrm>
                     <a:prstGeom prst="rect">
                       <a:avLst/>
@@ -561,54 +633,27 @@
       </w:r>
     </w:p>
     <w:p>
-      <w:r>
-        <w:t>Repositorio GitHub:</w:t>
-      </w:r>
-    </w:p>
-    <w:p>
-      <w:hyperlink r:id="rId10" w:history="1">
-        <w:r>
-          <w:rPr>
-            <w:rStyle w:val="Hipervnculo"/>
-          </w:rPr>
-          <w:t>https://github.com/DiegoPortoR/Programacion-Orientada-a-Objetos/blob/main/Entraga%201/Actividad_2.py</w:t>
-        </w:r>
-      </w:hyperlink>
-    </w:p>
-    <w:p/>
-    <w:p>
-      <w:pPr>
-        <w:rPr>
-          <w:b/>
-          <w:bCs/>
-        </w:rPr>
-      </w:pPr>
-      <w:r>
-        <w:rPr>
-          <w:b/>
-          <w:bCs/>
-        </w:rPr>
-        <w:t>Ejercicio #3</w:t>
-      </w:r>
-    </w:p>
-    <w:p>
-      <w:pPr>
-        <w:rPr>
-          <w:b/>
-          <w:bCs/>
-        </w:rPr>
-      </w:pPr>
-      <w:r>
-        <w:rPr>
-          <w:b/>
-          <w:bCs/>
-          <w:noProof/>
-        </w:rPr>
+      <w:pPr>
+        <w:rPr>
+          <w:b/>
+          <w:bCs/>
+          <w:sz w:val="40"/>
+          <w:szCs w:val="40"/>
+        </w:rPr>
+      </w:pPr>
+      <w:r>
+        <w:rPr>
+          <w:b/>
+          <w:bCs/>
+          <w:sz w:val="40"/>
+          <w:szCs w:val="40"/>
+        </w:rPr>
+        <w:lastRenderedPageBreak/>
         <w:drawing>
-          <wp:inline distT="0" distB="0" distL="0" distR="0" wp14:anchorId="66F7BA61" wp14:editId="49C505D5">
-            <wp:extent cx="5387340" cy="653465"/>
-            <wp:effectExtent l="0" t="0" r="3810" b="0"/>
-            <wp:docPr id="1390178949" name="Imagen 1"/>
+          <wp:inline distT="0" distB="0" distL="0" distR="0" wp14:anchorId="342D7522" wp14:editId="012E0CDA">
+            <wp:extent cx="6858000" cy="3885565"/>
+            <wp:effectExtent l="0" t="0" r="0" b="635"/>
+            <wp:docPr id="2049755518" name="Imagen 1"/>
             <wp:cNvGraphicFramePr>
               <a:graphicFrameLocks xmlns:a="http://schemas.openxmlformats.org/drawingml/2006/main" noChangeAspect="1"/>
             </wp:cNvGraphicFramePr>
@@ -616,7 +661,60 @@
               <a:graphicData uri="http://schemas.openxmlformats.org/drawingml/2006/picture">
                 <pic:pic xmlns:pic="http://schemas.openxmlformats.org/drawingml/2006/picture">
                   <pic:nvPicPr>
-                    <pic:cNvPr id="1390178949" name=""/>
+                    <pic:cNvPr id="2049755518" name=""/>
+                    <pic:cNvPicPr/>
+                  </pic:nvPicPr>
+                  <pic:blipFill>
+                    <a:blip r:embed="rId10"/>
+                    <a:stretch>
+                      <a:fillRect/>
+                    </a:stretch>
+                  </pic:blipFill>
+                  <pic:spPr>
+                    <a:xfrm>
+                      <a:off x="0" y="0"/>
+                      <a:ext cx="6858000" cy="3885565"/>
+                    </a:xfrm>
+                    <a:prstGeom prst="rect">
+                      <a:avLst/>
+                    </a:prstGeom>
+                  </pic:spPr>
+                </pic:pic>
+              </a:graphicData>
+            </a:graphic>
+          </wp:inline>
+        </w:drawing>
+      </w:r>
+    </w:p>
+    <w:p>
+      <w:pPr>
+        <w:rPr>
+          <w:b/>
+          <w:bCs/>
+          <w:sz w:val="40"/>
+          <w:szCs w:val="40"/>
+        </w:rPr>
+      </w:pPr>
+      <w:r>
+        <w:rPr>
+          <w:b/>
+          <w:bCs/>
+          <w:sz w:val="40"/>
+          <w:szCs w:val="40"/>
+        </w:rPr>
+        <w:drawing>
+          <wp:inline distT="0" distB="0" distL="0" distR="0" wp14:anchorId="081F3F72" wp14:editId="5734982E">
+            <wp:extent cx="6858000" cy="3676650"/>
+            <wp:effectExtent l="0" t="0" r="0" b="0"/>
+            <wp:docPr id="1449166430" name="Imagen 1"/>
+            <wp:cNvGraphicFramePr>
+              <a:graphicFrameLocks xmlns:a="http://schemas.openxmlformats.org/drawingml/2006/main" noChangeAspect="1"/>
+            </wp:cNvGraphicFramePr>
+            <a:graphic xmlns:a="http://schemas.openxmlformats.org/drawingml/2006/main">
+              <a:graphicData uri="http://schemas.openxmlformats.org/drawingml/2006/picture">
+                <pic:pic xmlns:pic="http://schemas.openxmlformats.org/drawingml/2006/picture">
+                  <pic:nvPicPr>
+                    <pic:cNvPr id="1449166430" name=""/>
                     <pic:cNvPicPr/>
                   </pic:nvPicPr>
                   <pic:blipFill>
@@ -628,7 +726,7 @@
                   <pic:spPr>
                     <a:xfrm>
                       <a:off x="0" y="0"/>
-                      <a:ext cx="5455632" cy="661749"/>
+                      <a:ext cx="6858000" cy="3676650"/>
                     </a:xfrm>
                     <a:prstGeom prst="rect">
                       <a:avLst/>
@@ -643,22 +741,28 @@
     </w:p>
     <w:p>
       <w:pPr>
-        <w:rPr>
-          <w:b/>
-          <w:bCs/>
-        </w:rPr>
-      </w:pPr>
-      <w:r>
-        <w:rPr>
-          <w:b/>
-          <w:bCs/>
-          <w:noProof/>
-        </w:rPr>
+        <w:jc w:val="center"/>
+        <w:rPr>
+          <w:b/>
+          <w:bCs/>
+          <w:sz w:val="40"/>
+          <w:szCs w:val="40"/>
+          <w:u w:val="single"/>
+        </w:rPr>
+      </w:pPr>
+      <w:r>
+        <w:rPr>
+          <w:b/>
+          <w:bCs/>
+          <w:sz w:val="40"/>
+          <w:szCs w:val="40"/>
+        </w:rPr>
+        <w:lastRenderedPageBreak/>
         <w:drawing>
-          <wp:inline distT="0" distB="0" distL="0" distR="0" wp14:anchorId="668988CA" wp14:editId="71AB79A8">
-            <wp:extent cx="5516880" cy="3145645"/>
-            <wp:effectExtent l="0" t="0" r="7620" b="0"/>
-            <wp:docPr id="810534697" name="Imagen 1" descr="Texto&#10;&#10;El contenido generado por IA puede ser incorrecto."/>
+          <wp:inline distT="0" distB="0" distL="0" distR="0" wp14:anchorId="5AED42C2" wp14:editId="7D3BF1CF">
+            <wp:extent cx="2096820" cy="3985260"/>
+            <wp:effectExtent l="0" t="0" r="0" b="0"/>
+            <wp:docPr id="1350914680" name="Imagen 1"/>
             <wp:cNvGraphicFramePr>
               <a:graphicFrameLocks xmlns:a="http://schemas.openxmlformats.org/drawingml/2006/main" noChangeAspect="1"/>
             </wp:cNvGraphicFramePr>
@@ -666,7 +770,7 @@
               <a:graphicData uri="http://schemas.openxmlformats.org/drawingml/2006/picture">
                 <pic:pic xmlns:pic="http://schemas.openxmlformats.org/drawingml/2006/picture">
                   <pic:nvPicPr>
-                    <pic:cNvPr id="810534697" name="Imagen 1" descr="Texto&#10;&#10;El contenido generado por IA puede ser incorrecto."/>
+                    <pic:cNvPr id="1350914680" name=""/>
                     <pic:cNvPicPr/>
                   </pic:nvPicPr>
                   <pic:blipFill>
@@ -678,7 +782,7 @@
                   <pic:spPr>
                     <a:xfrm>
                       <a:off x="0" y="0"/>
-                      <a:ext cx="5544039" cy="3161130"/>
+                      <a:ext cx="2101045" cy="3993290"/>
                     </a:xfrm>
                     <a:prstGeom prst="rect">
                       <a:avLst/>
@@ -692,46 +796,40 @@
       </w:r>
     </w:p>
     <w:p>
-      <w:r>
-        <w:t>Repositorio GitHub:</w:t>
-      </w:r>
-    </w:p>
-    <w:p>
-      <w:hyperlink r:id="rId13" w:history="1">
-        <w:r>
-          <w:rPr>
-            <w:rStyle w:val="Hipervnculo"/>
-          </w:rPr>
-          <w:t>https://github.com/DiegoPortoR/Programacion-Orientada-a-Objetos/blob/main/Entraga%201/Actividad_3.py</w:t>
-        </w:r>
-      </w:hyperlink>
-    </w:p>
-    <w:p/>
-    <w:p>
-      <w:pPr>
-        <w:rPr>
-          <w:b/>
-          <w:bCs/>
-        </w:rPr>
-      </w:pPr>
-      <w:r>
-        <w:rPr>
-          <w:b/>
-          <w:bCs/>
-        </w:rPr>
-        <w:t>Ejercicio #4</w:t>
-      </w:r>
-    </w:p>
-    <w:p>
-      <w:r>
-        <w:rPr>
-          <w:noProof/>
+      <w:pPr>
+        <w:rPr>
+          <w:b/>
+          <w:bCs/>
+          <w:sz w:val="40"/>
+          <w:szCs w:val="40"/>
+          <w:u w:val="single"/>
+        </w:rPr>
+      </w:pPr>
+    </w:p>
+    <w:p>
+      <w:pPr>
+        <w:jc w:val="center"/>
+        <w:rPr>
+          <w:b/>
+          <w:bCs/>
+          <w:sz w:val="40"/>
+          <w:szCs w:val="40"/>
+          <w:u w:val="single"/>
+        </w:rPr>
+      </w:pPr>
+      <w:r>
+        <w:rPr>
+          <w:b/>
+          <w:bCs/>
+          <w:sz w:val="40"/>
+          <w:szCs w:val="40"/>
+          <w:u w:val="single"/>
         </w:rPr>
         <w:drawing>
-          <wp:inline distT="0" distB="0" distL="0" distR="0" wp14:anchorId="0186E851" wp14:editId="3C637B58">
-            <wp:extent cx="4846320" cy="370205"/>
-            <wp:effectExtent l="0" t="0" r="0" b="0"/>
-            <wp:docPr id="152572810" name="Imagen 1"/>
+          <wp:inline distT="0" distB="0" distL="0" distR="0" wp14:anchorId="7728C6E8" wp14:editId="7F1B0778">
+            <wp:extent cx="3191919" cy="4145280"/>
+            <wp:effectExtent l="0" t="0" r="8890" b="7620"/>
+            <wp:docPr id="2129132700" name="Imagen 1"/>
             <wp:cNvGraphicFramePr>
               <a:graphicFrameLocks xmlns:a="http://schemas.openxmlformats.org/drawingml/2006/main" noChangeAspect="1"/>
             </wp:cNvGraphicFramePr>
@@ -739,7 +837,64 @@
               <a:graphicData uri="http://schemas.openxmlformats.org/drawingml/2006/picture">
                 <pic:pic xmlns:pic="http://schemas.openxmlformats.org/drawingml/2006/picture">
                   <pic:nvPicPr>
-                    <pic:cNvPr id="152572810" name=""/>
+                    <pic:cNvPr id="2129132700" name=""/>
+                    <pic:cNvPicPr/>
+                  </pic:nvPicPr>
+                  <pic:blipFill>
+                    <a:blip r:embed="rId13"/>
+                    <a:stretch>
+                      <a:fillRect/>
+                    </a:stretch>
+                  </pic:blipFill>
+                  <pic:spPr>
+                    <a:xfrm>
+                      <a:off x="0" y="0"/>
+                      <a:ext cx="3191919" cy="4145280"/>
+                    </a:xfrm>
+                    <a:prstGeom prst="rect">
+                      <a:avLst/>
+                    </a:prstGeom>
+                  </pic:spPr>
+                </pic:pic>
+              </a:graphicData>
+            </a:graphic>
+          </wp:inline>
+        </w:drawing>
+      </w:r>
+    </w:p>
+    <w:p>
+      <w:pPr>
+        <w:jc w:val="center"/>
+        <w:rPr>
+          <w:b/>
+          <w:bCs/>
+          <w:sz w:val="40"/>
+          <w:szCs w:val="40"/>
+          <w:u w:val="single"/>
+        </w:rPr>
+      </w:pPr>
+      <w:r>
+        <w:rPr>
+          <w:b/>
+          <w:bCs/>
+          <w:sz w:val="40"/>
+          <w:szCs w:val="40"/>
+          <w:u w:val="single"/>
+        </w:rPr>
+        <w:lastRenderedPageBreak/>
+        <w:drawing>
+          <wp:inline distT="0" distB="0" distL="0" distR="0" wp14:anchorId="7C2DCDAB" wp14:editId="4149B7A7">
+            <wp:extent cx="6858000" cy="2442845"/>
+            <wp:effectExtent l="0" t="0" r="0" b="0"/>
+            <wp:docPr id="1549164701" name="Imagen 1"/>
+            <wp:cNvGraphicFramePr>
+              <a:graphicFrameLocks xmlns:a="http://schemas.openxmlformats.org/drawingml/2006/main" noChangeAspect="1"/>
+            </wp:cNvGraphicFramePr>
+            <a:graphic xmlns:a="http://schemas.openxmlformats.org/drawingml/2006/main">
+              <a:graphicData uri="http://schemas.openxmlformats.org/drawingml/2006/picture">
+                <pic:pic xmlns:pic="http://schemas.openxmlformats.org/drawingml/2006/picture">
+                  <pic:nvPicPr>
+                    <pic:cNvPr id="1549164701" name=""/>
                     <pic:cNvPicPr/>
                   </pic:nvPicPr>
                   <pic:blipFill>
@@ -751,7 +906,7 @@
                   <pic:spPr>
                     <a:xfrm>
                       <a:off x="0" y="0"/>
-                      <a:ext cx="4909418" cy="375025"/>
+                      <a:ext cx="6858000" cy="2442845"/>
                     </a:xfrm>
                     <a:prstGeom prst="rect">
                       <a:avLst/>
@@ -764,17 +919,92 @@
         </w:drawing>
       </w:r>
     </w:p>
-    <w:p>
-      <w:r>
-        <w:rPr>
-          <w:noProof/>
-        </w:rPr>
-        <w:lastRenderedPageBreak/>
+    <w:p/>
+    <w:p>
+      <w:pPr>
+        <w:rPr>
+          <w:b/>
+          <w:bCs/>
+          <w:sz w:val="40"/>
+          <w:szCs w:val="40"/>
+        </w:rPr>
+      </w:pPr>
+      <w:r>
+        <w:rPr>
+          <w:b/>
+          <w:bCs/>
+          <w:sz w:val="40"/>
+          <w:szCs w:val="40"/>
+        </w:rPr>
+        <w:t>Ejercicio #2</w:t>
+      </w:r>
+      <w:r>
+        <w:rPr>
+          <w:b/>
+          <w:bCs/>
+          <w:sz w:val="40"/>
+          <w:szCs w:val="40"/>
+        </w:rPr>
+        <w:t xml:space="preserve"> </w:t>
+      </w:r>
+      <w:r>
+        <w:rPr>
+          <w:b/>
+          <w:bCs/>
+          <w:sz w:val="40"/>
+          <w:szCs w:val="40"/>
+        </w:rPr>
+        <w:t>–</w:t>
+      </w:r>
+      <w:r>
+        <w:rPr>
+          <w:b/>
+          <w:bCs/>
+          <w:sz w:val="40"/>
+          <w:szCs w:val="40"/>
+        </w:rPr>
+        <w:t xml:space="preserve"> </w:t>
+      </w:r>
+      <w:r>
+        <w:rPr>
+          <w:b/>
+          <w:bCs/>
+          <w:sz w:val="40"/>
+          <w:szCs w:val="40"/>
+        </w:rPr>
+        <w:t xml:space="preserve">Ejercicio </w:t>
+      </w:r>
+      <w:r>
+        <w:rPr>
+          <w:b/>
+          <w:bCs/>
+          <w:sz w:val="40"/>
+          <w:szCs w:val="40"/>
+        </w:rPr>
+        <w:t>8.3</w:t>
+      </w:r>
+    </w:p>
+    <w:p>
+      <w:pPr>
+        <w:rPr>
+          <w:b/>
+          <w:bCs/>
+          <w:sz w:val="40"/>
+          <w:szCs w:val="40"/>
+        </w:rPr>
+      </w:pPr>
+      <w:r>
+        <w:rPr>
+          <w:b/>
+          <w:bCs/>
+          <w:sz w:val="40"/>
+          <w:szCs w:val="40"/>
+        </w:rPr>
         <w:drawing>
-          <wp:inline distT="0" distB="0" distL="0" distR="0" wp14:anchorId="6A36AEA6" wp14:editId="58F7F4E6">
-            <wp:extent cx="5615940" cy="2740372"/>
-            <wp:effectExtent l="0" t="0" r="3810" b="3175"/>
-            <wp:docPr id="868108865" name="Imagen 1"/>
+          <wp:inline distT="0" distB="0" distL="0" distR="0" wp14:anchorId="35B4842C" wp14:editId="31CA24C5">
+            <wp:extent cx="6858000" cy="3002915"/>
+            <wp:effectExtent l="0" t="0" r="0" b="6985"/>
+            <wp:docPr id="893318577" name="Imagen 1"/>
             <wp:cNvGraphicFramePr>
               <a:graphicFrameLocks xmlns:a="http://schemas.openxmlformats.org/drawingml/2006/main" noChangeAspect="1"/>
             </wp:cNvGraphicFramePr>
@@ -782,11 +1012,78 @@
               <a:graphicData uri="http://schemas.openxmlformats.org/drawingml/2006/picture">
                 <pic:pic xmlns:pic="http://schemas.openxmlformats.org/drawingml/2006/picture">
                   <pic:nvPicPr>
-                    <pic:cNvPr id="868108865" name=""/>
+                    <pic:cNvPr id="893318577" name=""/>
+                    <pic:cNvPicPr/>
+                  </pic:nvPicPr>
+                  <pic:blipFill rotWithShape="1">
+                    <a:blip r:embed="rId15"/>
+                    <a:srcRect t="12247"/>
+                    <a:stretch>
+                      <a:fillRect/>
+                    </a:stretch>
+                  </pic:blipFill>
+                  <pic:spPr bwMode="auto">
+                    <a:xfrm>
+                      <a:off x="0" y="0"/>
+                      <a:ext cx="6858000" cy="3002915"/>
+                    </a:xfrm>
+                    <a:prstGeom prst="rect">
+                      <a:avLst/>
+                    </a:prstGeom>
+                    <a:ln>
+                      <a:noFill/>
+                    </a:ln>
+                    <a:extLst>
+                      <a:ext uri="{53640926-AAD7-44D8-BBD7-CCE9431645EC}">
+                        <a14:shadowObscured xmlns:a14="http://schemas.microsoft.com/office/drawing/2010/main"/>
+                      </a:ext>
+                    </a:extLst>
+                  </pic:spPr>
+                </pic:pic>
+              </a:graphicData>
+            </a:graphic>
+          </wp:inline>
+        </w:drawing>
+      </w:r>
+    </w:p>
+    <w:p>
+      <w:pPr>
+        <w:rPr>
+          <w:b/>
+          <w:bCs/>
+        </w:rPr>
+      </w:pPr>
+    </w:p>
+    <w:p>
+      <w:pPr>
+        <w:rPr>
+          <w:b/>
+          <w:bCs/>
+        </w:rPr>
+      </w:pPr>
+      <w:r>
+        <w:rPr>
+          <w:b/>
+          <w:bCs/>
+        </w:rPr>
+        <w:lastRenderedPageBreak/>
+        <w:drawing>
+          <wp:inline distT="0" distB="0" distL="0" distR="0" wp14:anchorId="3C478AEA" wp14:editId="0FD2796D">
+            <wp:extent cx="5852160" cy="4107891"/>
+            <wp:effectExtent l="0" t="0" r="0" b="6985"/>
+            <wp:docPr id="240473019" name="Imagen 1"/>
+            <wp:cNvGraphicFramePr>
+              <a:graphicFrameLocks xmlns:a="http://schemas.openxmlformats.org/drawingml/2006/main" noChangeAspect="1"/>
+            </wp:cNvGraphicFramePr>
+            <a:graphic xmlns:a="http://schemas.openxmlformats.org/drawingml/2006/main">
+              <a:graphicData uri="http://schemas.openxmlformats.org/drawingml/2006/picture">
+                <pic:pic xmlns:pic="http://schemas.openxmlformats.org/drawingml/2006/picture">
+                  <pic:nvPicPr>
+                    <pic:cNvPr id="240473019" name=""/>
                     <pic:cNvPicPr/>
                   </pic:nvPicPr>
                   <pic:blipFill>
-                    <a:blip r:embed="rId15"/>
+                    <a:blip r:embed="rId16"/>
                     <a:stretch>
                       <a:fillRect/>
                     </a:stretch>
@@ -794,7 +1091,7 @@
                   <pic:spPr>
                     <a:xfrm>
                       <a:off x="0" y="0"/>
-                      <a:ext cx="5672396" cy="2767920"/>
+                      <a:ext cx="5854345" cy="4109425"/>
                     </a:xfrm>
                     <a:prstGeom prst="rect">
                       <a:avLst/>
@@ -808,54 +1105,22 @@
       </w:r>
     </w:p>
     <w:p>
-      <w:r>
-        <w:t>Repositorio GitHub:</w:t>
-      </w:r>
-    </w:p>
-    <w:p>
-      <w:hyperlink r:id="rId16" w:history="1">
-        <w:r>
-          <w:rPr>
-            <w:rStyle w:val="Hipervnculo"/>
-          </w:rPr>
-          <w:t>https://github.com/DiegoPortoR/Programacion-Orientada-a-Objetos/blob/main/Entraga%201/Actividad_4.py</w:t>
-        </w:r>
-      </w:hyperlink>
-    </w:p>
-    <w:p/>
-    <w:p>
-      <w:pPr>
-        <w:rPr>
-          <w:b/>
-          <w:bCs/>
-        </w:rPr>
-      </w:pPr>
-      <w:r>
-        <w:rPr>
-          <w:b/>
-          <w:bCs/>
-        </w:rPr>
-        <w:t>Ejercicio #5</w:t>
-      </w:r>
-    </w:p>
-    <w:p>
-      <w:pPr>
-        <w:rPr>
-          <w:b/>
-          <w:bCs/>
-        </w:rPr>
-      </w:pPr>
-      <w:r>
-        <w:rPr>
-          <w:b/>
-          <w:bCs/>
-          <w:noProof/>
+      <w:pPr>
+        <w:rPr>
+          <w:b/>
+          <w:bCs/>
+        </w:rPr>
+      </w:pPr>
+      <w:r>
+        <w:rPr>
+          <w:b/>
+          <w:bCs/>
         </w:rPr>
         <w:drawing>
-          <wp:inline distT="0" distB="0" distL="0" distR="0" wp14:anchorId="1D978109" wp14:editId="30A3FEF1">
-            <wp:extent cx="5768340" cy="499389"/>
-            <wp:effectExtent l="0" t="0" r="3810" b="0"/>
-            <wp:docPr id="880433584" name="Imagen 1"/>
+          <wp:inline distT="0" distB="0" distL="0" distR="0" wp14:anchorId="1C6869EF" wp14:editId="7622E0BC">
+            <wp:extent cx="5814060" cy="4887041"/>
+            <wp:effectExtent l="0" t="0" r="0" b="8890"/>
+            <wp:docPr id="1963865664" name="Imagen 1"/>
             <wp:cNvGraphicFramePr>
               <a:graphicFrameLocks xmlns:a="http://schemas.openxmlformats.org/drawingml/2006/main" noChangeAspect="1"/>
             </wp:cNvGraphicFramePr>
@@ -863,7 +1128,7 @@
               <a:graphicData uri="http://schemas.openxmlformats.org/drawingml/2006/picture">
                 <pic:pic xmlns:pic="http://schemas.openxmlformats.org/drawingml/2006/picture">
                   <pic:nvPicPr>
-                    <pic:cNvPr id="880433584" name=""/>
+                    <pic:cNvPr id="1963865664" name=""/>
                     <pic:cNvPicPr/>
                   </pic:nvPicPr>
                   <pic:blipFill>
@@ -875,7 +1140,7 @@
                   <pic:spPr>
                     <a:xfrm>
                       <a:off x="0" y="0"/>
-                      <a:ext cx="5819296" cy="503800"/>
+                      <a:ext cx="5815856" cy="4888551"/>
                     </a:xfrm>
                     <a:prstGeom prst="rect">
                       <a:avLst/>
@@ -899,13 +1164,13 @@
         <w:rPr>
           <w:b/>
           <w:bCs/>
-          <w:noProof/>
-        </w:rPr>
+        </w:rPr>
+        <w:lastRenderedPageBreak/>
         <w:drawing>
-          <wp:inline distT="0" distB="0" distL="0" distR="0" wp14:anchorId="3B444CD4" wp14:editId="47AA9A72">
-            <wp:extent cx="6858000" cy="2614295"/>
-            <wp:effectExtent l="0" t="0" r="0" b="0"/>
-            <wp:docPr id="508351058" name="Imagen 1" descr="Captura de pantalla de un celular&#10;&#10;El contenido generado por IA puede ser incorrecto."/>
+          <wp:inline distT="0" distB="0" distL="0" distR="0" wp14:anchorId="78EF41C7" wp14:editId="1C622C7C">
+            <wp:extent cx="5886040" cy="3718560"/>
+            <wp:effectExtent l="0" t="0" r="635" b="0"/>
+            <wp:docPr id="44076660" name="Imagen 1"/>
             <wp:cNvGraphicFramePr>
               <a:graphicFrameLocks xmlns:a="http://schemas.openxmlformats.org/drawingml/2006/main" noChangeAspect="1"/>
             </wp:cNvGraphicFramePr>
@@ -913,7 +1178,7 @@
               <a:graphicData uri="http://schemas.openxmlformats.org/drawingml/2006/picture">
                 <pic:pic xmlns:pic="http://schemas.openxmlformats.org/drawingml/2006/picture">
                   <pic:nvPicPr>
-                    <pic:cNvPr id="508351058" name="Imagen 1" descr="Captura de pantalla de un celular&#10;&#10;El contenido generado por IA puede ser incorrecto."/>
+                    <pic:cNvPr id="44076660" name=""/>
                     <pic:cNvPicPr/>
                   </pic:nvPicPr>
                   <pic:blipFill>
@@ -925,7 +1190,7 @@
                   <pic:spPr>
                     <a:xfrm>
                       <a:off x="0" y="0"/>
-                      <a:ext cx="6858000" cy="2614295"/>
+                      <a:ext cx="5893883" cy="3723515"/>
                     </a:xfrm>
                     <a:prstGeom prst="rect">
                       <a:avLst/>
@@ -939,22 +1204,541 @@
       </w:r>
     </w:p>
     <w:p>
-      <w:r>
-        <w:t>Repositorio GitHub:</w:t>
-      </w:r>
-    </w:p>
-    <w:p>
-      <w:hyperlink r:id="rId19" w:history="1">
-        <w:r>
-          <w:rPr>
-            <w:rStyle w:val="Hipervnculo"/>
-          </w:rPr>
-          <w:t>https://github.com/DiegoPortoR/Programacion-Orientada-a-Objetos/blob/main/Entraga%201/Actividad_5.py</w:t>
-        </w:r>
-      </w:hyperlink>
+      <w:pPr>
+        <w:rPr>
+          <w:b/>
+          <w:bCs/>
+        </w:rPr>
+      </w:pPr>
+      <w:r>
+        <w:rPr>
+          <w:b/>
+          <w:bCs/>
+        </w:rPr>
+        <w:drawing>
+          <wp:inline distT="0" distB="0" distL="0" distR="0" wp14:anchorId="0EB1795F" wp14:editId="73CD2184">
+            <wp:extent cx="6858000" cy="3665855"/>
+            <wp:effectExtent l="0" t="0" r="0" b="0"/>
+            <wp:docPr id="1864379153" name="Imagen 1"/>
+            <wp:cNvGraphicFramePr>
+              <a:graphicFrameLocks xmlns:a="http://schemas.openxmlformats.org/drawingml/2006/main" noChangeAspect="1"/>
+            </wp:cNvGraphicFramePr>
+            <a:graphic xmlns:a="http://schemas.openxmlformats.org/drawingml/2006/main">
+              <a:graphicData uri="http://schemas.openxmlformats.org/drawingml/2006/picture">
+                <pic:pic xmlns:pic="http://schemas.openxmlformats.org/drawingml/2006/picture">
+                  <pic:nvPicPr>
+                    <pic:cNvPr id="1864379153" name=""/>
+                    <pic:cNvPicPr/>
+                  </pic:nvPicPr>
+                  <pic:blipFill>
+                    <a:blip r:embed="rId19"/>
+                    <a:stretch>
+                      <a:fillRect/>
+                    </a:stretch>
+                  </pic:blipFill>
+                  <pic:spPr>
+                    <a:xfrm>
+                      <a:off x="0" y="0"/>
+                      <a:ext cx="6774180" cy="3621050"/>
+                    </a:xfrm>
+                    <a:prstGeom prst="rect">
+                      <a:avLst/>
+                    </a:prstGeom>
+                  </pic:spPr>
+                </pic:pic>
+              </a:graphicData>
+            </a:graphic>
+          </wp:inline>
+        </w:drawing>
+      </w:r>
+    </w:p>
+    <w:p>
+      <w:r>
+        <w:lastRenderedPageBreak/>
+        <w:drawing>
+          <wp:inline distT="0" distB="0" distL="0" distR="0" wp14:anchorId="24CE317A" wp14:editId="45E87830">
+            <wp:extent cx="6454140" cy="3173286"/>
+            <wp:effectExtent l="0" t="0" r="3810" b="8255"/>
+            <wp:docPr id="1792074452" name="Imagen 1"/>
+            <wp:cNvGraphicFramePr>
+              <a:graphicFrameLocks xmlns:a="http://schemas.openxmlformats.org/drawingml/2006/main" noChangeAspect="1"/>
+            </wp:cNvGraphicFramePr>
+            <a:graphic xmlns:a="http://schemas.openxmlformats.org/drawingml/2006/main">
+              <a:graphicData uri="http://schemas.openxmlformats.org/drawingml/2006/picture">
+                <pic:pic xmlns:pic="http://schemas.openxmlformats.org/drawingml/2006/picture">
+                  <pic:nvPicPr>
+                    <pic:cNvPr id="1792074452" name=""/>
+                    <pic:cNvPicPr/>
+                  </pic:nvPicPr>
+                  <pic:blipFill>
+                    <a:blip r:embed="rId20"/>
+                    <a:stretch>
+                      <a:fillRect/>
+                    </a:stretch>
+                  </pic:blipFill>
+                  <pic:spPr>
+                    <a:xfrm>
+                      <a:off x="0" y="0"/>
+                      <a:ext cx="6460681" cy="3176502"/>
+                    </a:xfrm>
+                    <a:prstGeom prst="rect">
+                      <a:avLst/>
+                    </a:prstGeom>
+                  </pic:spPr>
+                </pic:pic>
+              </a:graphicData>
+            </a:graphic>
+          </wp:inline>
+        </w:drawing>
+      </w:r>
+    </w:p>
+    <w:p>
+      <w:r>
+        <w:drawing>
+          <wp:inline distT="0" distB="0" distL="0" distR="0" wp14:anchorId="709A6ACD" wp14:editId="72CF4410">
+            <wp:extent cx="6576060" cy="3295946"/>
+            <wp:effectExtent l="0" t="0" r="0" b="0"/>
+            <wp:docPr id="1896125643" name="Imagen 1"/>
+            <wp:cNvGraphicFramePr>
+              <a:graphicFrameLocks xmlns:a="http://schemas.openxmlformats.org/drawingml/2006/main" noChangeAspect="1"/>
+            </wp:cNvGraphicFramePr>
+            <a:graphic xmlns:a="http://schemas.openxmlformats.org/drawingml/2006/main">
+              <a:graphicData uri="http://schemas.openxmlformats.org/drawingml/2006/picture">
+                <pic:pic xmlns:pic="http://schemas.openxmlformats.org/drawingml/2006/picture">
+                  <pic:nvPicPr>
+                    <pic:cNvPr id="1896125643" name=""/>
+                    <pic:cNvPicPr/>
+                  </pic:nvPicPr>
+                  <pic:blipFill>
+                    <a:blip r:embed="rId21"/>
+                    <a:stretch>
+                      <a:fillRect/>
+                    </a:stretch>
+                  </pic:blipFill>
+                  <pic:spPr>
+                    <a:xfrm>
+                      <a:off x="0" y="0"/>
+                      <a:ext cx="6583114" cy="3299481"/>
+                    </a:xfrm>
+                    <a:prstGeom prst="rect">
+                      <a:avLst/>
+                    </a:prstGeom>
+                  </pic:spPr>
+                </pic:pic>
+              </a:graphicData>
+            </a:graphic>
+          </wp:inline>
+        </w:drawing>
+      </w:r>
+    </w:p>
+    <w:p>
+      <w:r>
+        <w:lastRenderedPageBreak/>
+        <w:drawing>
+          <wp:inline distT="0" distB="0" distL="0" distR="0" wp14:anchorId="6A3219A9" wp14:editId="16A35EEE">
+            <wp:extent cx="6858000" cy="3344545"/>
+            <wp:effectExtent l="0" t="0" r="0" b="8255"/>
+            <wp:docPr id="426522858" name="Imagen 1"/>
+            <wp:cNvGraphicFramePr>
+              <a:graphicFrameLocks xmlns:a="http://schemas.openxmlformats.org/drawingml/2006/main" noChangeAspect="1"/>
+            </wp:cNvGraphicFramePr>
+            <a:graphic xmlns:a="http://schemas.openxmlformats.org/drawingml/2006/main">
+              <a:graphicData uri="http://schemas.openxmlformats.org/drawingml/2006/picture">
+                <pic:pic xmlns:pic="http://schemas.openxmlformats.org/drawingml/2006/picture">
+                  <pic:nvPicPr>
+                    <pic:cNvPr id="426522858" name=""/>
+                    <pic:cNvPicPr/>
+                  </pic:nvPicPr>
+                  <pic:blipFill>
+                    <a:blip r:embed="rId22"/>
+                    <a:stretch>
+                      <a:fillRect/>
+                    </a:stretch>
+                  </pic:blipFill>
+                  <pic:spPr>
+                    <a:xfrm>
+                      <a:off x="0" y="0"/>
+                      <a:ext cx="6858000" cy="3344545"/>
+                    </a:xfrm>
+                    <a:prstGeom prst="rect">
+                      <a:avLst/>
+                    </a:prstGeom>
+                  </pic:spPr>
+                </pic:pic>
+              </a:graphicData>
+            </a:graphic>
+          </wp:inline>
+        </w:drawing>
+      </w:r>
+    </w:p>
+    <w:p>
+      <w:r>
+        <w:drawing>
+          <wp:inline distT="0" distB="0" distL="0" distR="0" wp14:anchorId="78A52E1C" wp14:editId="7BB99E74">
+            <wp:extent cx="6858000" cy="3644900"/>
+            <wp:effectExtent l="0" t="0" r="0" b="0"/>
+            <wp:docPr id="1175299656" name="Imagen 1"/>
+            <wp:cNvGraphicFramePr>
+              <a:graphicFrameLocks xmlns:a="http://schemas.openxmlformats.org/drawingml/2006/main" noChangeAspect="1"/>
+            </wp:cNvGraphicFramePr>
+            <a:graphic xmlns:a="http://schemas.openxmlformats.org/drawingml/2006/main">
+              <a:graphicData uri="http://schemas.openxmlformats.org/drawingml/2006/picture">
+                <pic:pic xmlns:pic="http://schemas.openxmlformats.org/drawingml/2006/picture">
+                  <pic:nvPicPr>
+                    <pic:cNvPr id="1175299656" name=""/>
+                    <pic:cNvPicPr/>
+                  </pic:nvPicPr>
+                  <pic:blipFill>
+                    <a:blip r:embed="rId23"/>
+                    <a:stretch>
+                      <a:fillRect/>
+                    </a:stretch>
+                  </pic:blipFill>
+                  <pic:spPr>
+                    <a:xfrm>
+                      <a:off x="0" y="0"/>
+                      <a:ext cx="6858000" cy="3644900"/>
+                    </a:xfrm>
+                    <a:prstGeom prst="rect">
+                      <a:avLst/>
+                    </a:prstGeom>
+                  </pic:spPr>
+                </pic:pic>
+              </a:graphicData>
+            </a:graphic>
+          </wp:inline>
+        </w:drawing>
+      </w:r>
+    </w:p>
+    <w:p>
+      <w:r>
+        <w:lastRenderedPageBreak/>
+        <w:drawing>
+          <wp:inline distT="0" distB="0" distL="0" distR="0" wp14:anchorId="16E7C3AD" wp14:editId="2B238565">
+            <wp:extent cx="6858000" cy="3879215"/>
+            <wp:effectExtent l="0" t="0" r="0" b="6985"/>
+            <wp:docPr id="1553072822" name="Imagen 1"/>
+            <wp:cNvGraphicFramePr>
+              <a:graphicFrameLocks xmlns:a="http://schemas.openxmlformats.org/drawingml/2006/main" noChangeAspect="1"/>
+            </wp:cNvGraphicFramePr>
+            <a:graphic xmlns:a="http://schemas.openxmlformats.org/drawingml/2006/main">
+              <a:graphicData uri="http://schemas.openxmlformats.org/drawingml/2006/picture">
+                <pic:pic xmlns:pic="http://schemas.openxmlformats.org/drawingml/2006/picture">
+                  <pic:nvPicPr>
+                    <pic:cNvPr id="1553072822" name=""/>
+                    <pic:cNvPicPr/>
+                  </pic:nvPicPr>
+                  <pic:blipFill>
+                    <a:blip r:embed="rId24"/>
+                    <a:stretch>
+                      <a:fillRect/>
+                    </a:stretch>
+                  </pic:blipFill>
+                  <pic:spPr>
+                    <a:xfrm>
+                      <a:off x="0" y="0"/>
+                      <a:ext cx="6858000" cy="3879215"/>
+                    </a:xfrm>
+                    <a:prstGeom prst="rect">
+                      <a:avLst/>
+                    </a:prstGeom>
+                  </pic:spPr>
+                </pic:pic>
+              </a:graphicData>
+            </a:graphic>
+          </wp:inline>
+        </w:drawing>
+      </w:r>
+    </w:p>
+    <w:p>
+      <w:r>
+        <w:drawing>
+          <wp:inline distT="0" distB="0" distL="0" distR="0" wp14:anchorId="7054A7EC" wp14:editId="7AB81B8B">
+            <wp:extent cx="6858000" cy="3261995"/>
+            <wp:effectExtent l="0" t="0" r="0" b="0"/>
+            <wp:docPr id="1155567803" name="Imagen 1"/>
+            <wp:cNvGraphicFramePr>
+              <a:graphicFrameLocks xmlns:a="http://schemas.openxmlformats.org/drawingml/2006/main" noChangeAspect="1"/>
+            </wp:cNvGraphicFramePr>
+            <a:graphic xmlns:a="http://schemas.openxmlformats.org/drawingml/2006/main">
+              <a:graphicData uri="http://schemas.openxmlformats.org/drawingml/2006/picture">
+                <pic:pic xmlns:pic="http://schemas.openxmlformats.org/drawingml/2006/picture">
+                  <pic:nvPicPr>
+                    <pic:cNvPr id="1155567803" name=""/>
+                    <pic:cNvPicPr/>
+                  </pic:nvPicPr>
+                  <pic:blipFill>
+                    <a:blip r:embed="rId25"/>
+                    <a:stretch>
+                      <a:fillRect/>
+                    </a:stretch>
+                  </pic:blipFill>
+                  <pic:spPr>
+                    <a:xfrm>
+                      <a:off x="0" y="0"/>
+                      <a:ext cx="6858000" cy="3261995"/>
+                    </a:xfrm>
+                    <a:prstGeom prst="rect">
+                      <a:avLst/>
+                    </a:prstGeom>
+                  </pic:spPr>
+                </pic:pic>
+              </a:graphicData>
+            </a:graphic>
+          </wp:inline>
+        </w:drawing>
+      </w:r>
+    </w:p>
+    <w:p>
+      <w:r>
+        <w:drawing>
+          <wp:inline distT="0" distB="0" distL="0" distR="0" wp14:anchorId="15D69C50" wp14:editId="729B15F2">
+            <wp:extent cx="6217920" cy="1709352"/>
+            <wp:effectExtent l="0" t="0" r="0" b="5715"/>
+            <wp:docPr id="1903766653" name="Imagen 1"/>
+            <wp:cNvGraphicFramePr>
+              <a:graphicFrameLocks xmlns:a="http://schemas.openxmlformats.org/drawingml/2006/main" noChangeAspect="1"/>
+            </wp:cNvGraphicFramePr>
+            <a:graphic xmlns:a="http://schemas.openxmlformats.org/drawingml/2006/main">
+              <a:graphicData uri="http://schemas.openxmlformats.org/drawingml/2006/picture">
+                <pic:pic xmlns:pic="http://schemas.openxmlformats.org/drawingml/2006/picture">
+                  <pic:nvPicPr>
+                    <pic:cNvPr id="1903766653" name=""/>
+                    <pic:cNvPicPr/>
+                  </pic:nvPicPr>
+                  <pic:blipFill>
+                    <a:blip r:embed="rId26"/>
+                    <a:stretch>
+                      <a:fillRect/>
+                    </a:stretch>
+                  </pic:blipFill>
+                  <pic:spPr>
+                    <a:xfrm>
+                      <a:off x="0" y="0"/>
+                      <a:ext cx="6221995" cy="1710472"/>
+                    </a:xfrm>
+                    <a:prstGeom prst="rect">
+                      <a:avLst/>
+                    </a:prstGeom>
+                  </pic:spPr>
+                </pic:pic>
+              </a:graphicData>
+            </a:graphic>
+          </wp:inline>
+        </w:drawing>
+      </w:r>
+    </w:p>
+    <w:p>
+      <w:pPr>
+        <w:jc w:val="center"/>
+      </w:pPr>
+      <w:r>
+        <w:lastRenderedPageBreak/>
+        <w:drawing>
+          <wp:inline distT="0" distB="0" distL="0" distR="0" wp14:anchorId="6C45F6B3" wp14:editId="79A217AD">
+            <wp:extent cx="2956560" cy="2956560"/>
+            <wp:effectExtent l="0" t="0" r="0" b="0"/>
+            <wp:docPr id="2013935677" name="Imagen 1"/>
+            <wp:cNvGraphicFramePr>
+              <a:graphicFrameLocks xmlns:a="http://schemas.openxmlformats.org/drawingml/2006/main" noChangeAspect="1"/>
+            </wp:cNvGraphicFramePr>
+            <a:graphic xmlns:a="http://schemas.openxmlformats.org/drawingml/2006/main">
+              <a:graphicData uri="http://schemas.openxmlformats.org/drawingml/2006/picture">
+                <pic:pic xmlns:pic="http://schemas.openxmlformats.org/drawingml/2006/picture">
+                  <pic:nvPicPr>
+                    <pic:cNvPr id="2013935677" name=""/>
+                    <pic:cNvPicPr/>
+                  </pic:nvPicPr>
+                  <pic:blipFill>
+                    <a:blip r:embed="rId27"/>
+                    <a:stretch>
+                      <a:fillRect/>
+                    </a:stretch>
+                  </pic:blipFill>
+                  <pic:spPr>
+                    <a:xfrm>
+                      <a:off x="0" y="0"/>
+                      <a:ext cx="2956623" cy="2956623"/>
+                    </a:xfrm>
+                    <a:prstGeom prst="rect">
+                      <a:avLst/>
+                    </a:prstGeom>
+                  </pic:spPr>
+                </pic:pic>
+              </a:graphicData>
+            </a:graphic>
+          </wp:inline>
+        </w:drawing>
+      </w:r>
+    </w:p>
+    <w:p>
+      <w:pPr>
+        <w:jc w:val="center"/>
+      </w:pPr>
+      <w:r>
+        <w:drawing>
+          <wp:inline distT="0" distB="0" distL="0" distR="0" wp14:anchorId="272A6DEB" wp14:editId="4027AFAA">
+            <wp:extent cx="2943730" cy="2948940"/>
+            <wp:effectExtent l="0" t="0" r="9525" b="3810"/>
+            <wp:docPr id="2114863695" name="Imagen 1"/>
+            <wp:cNvGraphicFramePr>
+              <a:graphicFrameLocks xmlns:a="http://schemas.openxmlformats.org/drawingml/2006/main" noChangeAspect="1"/>
+            </wp:cNvGraphicFramePr>
+            <a:graphic xmlns:a="http://schemas.openxmlformats.org/drawingml/2006/main">
+              <a:graphicData uri="http://schemas.openxmlformats.org/drawingml/2006/picture">
+                <pic:pic xmlns:pic="http://schemas.openxmlformats.org/drawingml/2006/picture">
+                  <pic:nvPicPr>
+                    <pic:cNvPr id="2114863695" name=""/>
+                    <pic:cNvPicPr/>
+                  </pic:nvPicPr>
+                  <pic:blipFill>
+                    <a:blip r:embed="rId28"/>
+                    <a:stretch>
+                      <a:fillRect/>
+                    </a:stretch>
+                  </pic:blipFill>
+                  <pic:spPr>
+                    <a:xfrm>
+                      <a:off x="0" y="0"/>
+                      <a:ext cx="2951364" cy="2956588"/>
+                    </a:xfrm>
+                    <a:prstGeom prst="rect">
+                      <a:avLst/>
+                    </a:prstGeom>
+                  </pic:spPr>
+                </pic:pic>
+              </a:graphicData>
+            </a:graphic>
+          </wp:inline>
+        </w:drawing>
+      </w:r>
+    </w:p>
+    <w:p>
+      <w:pPr>
+        <w:jc w:val="center"/>
+      </w:pPr>
+      <w:r>
+        <w:drawing>
+          <wp:inline distT="0" distB="0" distL="0" distR="0" wp14:anchorId="0722317F" wp14:editId="754ADCBB">
+            <wp:extent cx="2933309" cy="2948940"/>
+            <wp:effectExtent l="0" t="0" r="635" b="3810"/>
+            <wp:docPr id="779733215" name="Imagen 1"/>
+            <wp:cNvGraphicFramePr>
+              <a:graphicFrameLocks xmlns:a="http://schemas.openxmlformats.org/drawingml/2006/main" noChangeAspect="1"/>
+            </wp:cNvGraphicFramePr>
+            <a:graphic xmlns:a="http://schemas.openxmlformats.org/drawingml/2006/main">
+              <a:graphicData uri="http://schemas.openxmlformats.org/drawingml/2006/picture">
+                <pic:pic xmlns:pic="http://schemas.openxmlformats.org/drawingml/2006/picture">
+                  <pic:nvPicPr>
+                    <pic:cNvPr id="779733215" name=""/>
+                    <pic:cNvPicPr/>
+                  </pic:nvPicPr>
+                  <pic:blipFill>
+                    <a:blip r:embed="rId29"/>
+                    <a:stretch>
+                      <a:fillRect/>
+                    </a:stretch>
+                  </pic:blipFill>
+                  <pic:spPr>
+                    <a:xfrm>
+                      <a:off x="0" y="0"/>
+                      <a:ext cx="2939682" cy="2955346"/>
+                    </a:xfrm>
+                    <a:prstGeom prst="rect">
+                      <a:avLst/>
+                    </a:prstGeom>
+                  </pic:spPr>
+                </pic:pic>
+              </a:graphicData>
+            </a:graphic>
+          </wp:inline>
+        </w:drawing>
+      </w:r>
+    </w:p>
+    <w:p>
+      <w:pPr>
+        <w:jc w:val="center"/>
+      </w:pPr>
+    </w:p>
+    <w:p>
+      <w:r>
+        <w:drawing>
+          <wp:inline distT="0" distB="0" distL="0" distR="0" wp14:anchorId="0FDA1033" wp14:editId="07F6A88B">
+            <wp:extent cx="6858000" cy="3660140"/>
+            <wp:effectExtent l="0" t="0" r="0" b="0"/>
+            <wp:docPr id="915494192" name="Imagen 1"/>
+            <wp:cNvGraphicFramePr>
+              <a:graphicFrameLocks xmlns:a="http://schemas.openxmlformats.org/drawingml/2006/main" noChangeAspect="1"/>
+            </wp:cNvGraphicFramePr>
+            <a:graphic xmlns:a="http://schemas.openxmlformats.org/drawingml/2006/main">
+              <a:graphicData uri="http://schemas.openxmlformats.org/drawingml/2006/picture">
+                <pic:pic xmlns:pic="http://schemas.openxmlformats.org/drawingml/2006/picture">
+                  <pic:nvPicPr>
+                    <pic:cNvPr id="915494192" name=""/>
+                    <pic:cNvPicPr/>
+                  </pic:nvPicPr>
+                  <pic:blipFill>
+                    <a:blip r:embed="rId30"/>
+                    <a:stretch>
+                      <a:fillRect/>
+                    </a:stretch>
+                  </pic:blipFill>
+                  <pic:spPr>
+                    <a:xfrm>
+                      <a:off x="0" y="0"/>
+                      <a:ext cx="6858000" cy="3660140"/>
+                    </a:xfrm>
+                    <a:prstGeom prst="rect">
+                      <a:avLst/>
+                    </a:prstGeom>
+                  </pic:spPr>
+                </pic:pic>
+              </a:graphicData>
+            </a:graphic>
+          </wp:inline>
+        </w:drawing>
+      </w:r>
     </w:p>
     <w:p/>
-    <w:p/>
+    <w:p>
+      <w:r>
+        <w:drawing>
+          <wp:inline distT="0" distB="0" distL="0" distR="0" wp14:anchorId="5DAA3710" wp14:editId="05076BDA">
+            <wp:extent cx="6858000" cy="4536440"/>
+            <wp:effectExtent l="0" t="0" r="0" b="0"/>
+            <wp:docPr id="553635438" name="Imagen 1"/>
+            <wp:cNvGraphicFramePr>
+              <a:graphicFrameLocks xmlns:a="http://schemas.openxmlformats.org/drawingml/2006/main" noChangeAspect="1"/>
+            </wp:cNvGraphicFramePr>
+            <a:graphic xmlns:a="http://schemas.openxmlformats.org/drawingml/2006/main">
+              <a:graphicData uri="http://schemas.openxmlformats.org/drawingml/2006/picture">
+                <pic:pic xmlns:pic="http://schemas.openxmlformats.org/drawingml/2006/picture">
+                  <pic:nvPicPr>
+                    <pic:cNvPr id="553635438" name=""/>
+                    <pic:cNvPicPr/>
+                  </pic:nvPicPr>
+                  <pic:blipFill>
+                    <a:blip r:embed="rId31"/>
+                    <a:stretch>
+                      <a:fillRect/>
+                    </a:stretch>
+                  </pic:blipFill>
+                  <pic:spPr>
+                    <a:xfrm>
+                      <a:off x="0" y="0"/>
+                      <a:ext cx="6858000" cy="4536440"/>
+                    </a:xfrm>
+                    <a:prstGeom prst="rect">
+                      <a:avLst/>
+                    </a:prstGeom>
+                  </pic:spPr>
+                </pic:pic>
+              </a:graphicData>
+            </a:graphic>
+          </wp:inline>
+        </w:drawing>
+      </w:r>
+    </w:p>
     <w:sectPr>
       <w:pgSz w:w="12240" w:h="15840"/>
       <w:pgMar w:top="720" w:right="720" w:bottom="720" w:left="720" w:header="708" w:footer="708" w:gutter="0"/>
@@ -1569,6 +2353,7 @@
   <w:style w:type="character" w:default="1" w:styleId="Fuentedeprrafopredeter">
     <w:name w:val="Default Paragraph Font"/>
     <w:uiPriority w:val="1"/>
+    <w:semiHidden/>
     <w:unhideWhenUsed/>
   </w:style>
   <w:style w:type="table" w:default="1" w:styleId="Tablanormal">

</xml_diff>